<commit_message>
update ch9 css and add screenshots
</commit_message>
<xml_diff>
--- a/ch9/M09 Screenshots.docx
+++ b/ch9/M09 Screenshots.docx
@@ -5,10 +5,10 @@
     <w:p>
       <w:r>
         <w:drawing>
-          <wp:inline distT="0" distB="0" distL="0" distR="0" wp14:anchorId="45859477" wp14:editId="28D81CEE">
-            <wp:extent cx="5733415" cy="6235065"/>
-            <wp:effectExtent l="0" t="0" r="635" b="0"/>
-            <wp:docPr id="1140035077" name="Picture 1"/>
+          <wp:inline distT="0" distB="0" distL="0" distR="0" wp14:anchorId="49C218DC" wp14:editId="789B5510">
+            <wp:extent cx="5733415" cy="3046095"/>
+            <wp:effectExtent l="0" t="0" r="635" b="1905"/>
+            <wp:docPr id="872679005" name="Picture 1"/>
             <wp:cNvGraphicFramePr>
               <a:graphicFrameLocks xmlns:a="http://schemas.openxmlformats.org/drawingml/2006/main" noChangeAspect="1"/>
             </wp:cNvGraphicFramePr>
@@ -16,7 +16,7 @@
               <a:graphicData uri="http://schemas.openxmlformats.org/drawingml/2006/picture">
                 <pic:pic xmlns:pic="http://schemas.openxmlformats.org/drawingml/2006/picture">
                   <pic:nvPicPr>
-                    <pic:cNvPr id="1140035077" name=""/>
+                    <pic:cNvPr id="872679005" name=""/>
                     <pic:cNvPicPr/>
                   </pic:nvPicPr>
                   <pic:blipFill>
@@ -28,7 +28,44 @@
                   <pic:spPr>
                     <a:xfrm>
                       <a:off x="0" y="0"/>
-                      <a:ext cx="5733415" cy="6235065"/>
+                      <a:ext cx="5733415" cy="3046095"/>
+                    </a:xfrm>
+                    <a:prstGeom prst="rect">
+                      <a:avLst/>
+                    </a:prstGeom>
+                  </pic:spPr>
+                </pic:pic>
+              </a:graphicData>
+            </a:graphic>
+          </wp:inline>
+        </w:drawing>
+      </w:r>
+      <w:r>
+        <w:drawing>
+          <wp:inline distT="0" distB="0" distL="0" distR="0" wp14:anchorId="6381F311" wp14:editId="1300A19C">
+            <wp:extent cx="5733415" cy="3046095"/>
+            <wp:effectExtent l="0" t="0" r="635" b="1905"/>
+            <wp:docPr id="1301978218" name="Picture 1"/>
+            <wp:cNvGraphicFramePr>
+              <a:graphicFrameLocks xmlns:a="http://schemas.openxmlformats.org/drawingml/2006/main" noChangeAspect="1"/>
+            </wp:cNvGraphicFramePr>
+            <a:graphic xmlns:a="http://schemas.openxmlformats.org/drawingml/2006/main">
+              <a:graphicData uri="http://schemas.openxmlformats.org/drawingml/2006/picture">
+                <pic:pic xmlns:pic="http://schemas.openxmlformats.org/drawingml/2006/picture">
+                  <pic:nvPicPr>
+                    <pic:cNvPr id="1301978218" name=""/>
+                    <pic:cNvPicPr/>
+                  </pic:nvPicPr>
+                  <pic:blipFill>
+                    <a:blip r:embed="rId5"/>
+                    <a:stretch>
+                      <a:fillRect/>
+                    </a:stretch>
+                  </pic:blipFill>
+                  <pic:spPr>
+                    <a:xfrm>
+                      <a:off x="0" y="0"/>
+                      <a:ext cx="5733415" cy="3046095"/>
                     </a:xfrm>
                     <a:prstGeom prst="rect">
                       <a:avLst/>
@@ -43,10 +80,10 @@
       <w:r>
         <w:lastRenderedPageBreak/>
         <w:drawing>
-          <wp:inline distT="0" distB="0" distL="0" distR="0" wp14:anchorId="6189EBD9" wp14:editId="5C2788E6">
-            <wp:extent cx="5733415" cy="6235065"/>
-            <wp:effectExtent l="0" t="0" r="635" b="0"/>
-            <wp:docPr id="1184301709" name="Picture 1"/>
+          <wp:inline distT="0" distB="0" distL="0" distR="0" wp14:anchorId="670BA5F2" wp14:editId="597D1EEA">
+            <wp:extent cx="5733415" cy="3046095"/>
+            <wp:effectExtent l="0" t="0" r="635" b="1905"/>
+            <wp:docPr id="1502895438" name="Picture 1"/>
             <wp:cNvGraphicFramePr>
               <a:graphicFrameLocks xmlns:a="http://schemas.openxmlformats.org/drawingml/2006/main" noChangeAspect="1"/>
             </wp:cNvGraphicFramePr>
@@ -54,11 +91,11 @@
               <a:graphicData uri="http://schemas.openxmlformats.org/drawingml/2006/picture">
                 <pic:pic xmlns:pic="http://schemas.openxmlformats.org/drawingml/2006/picture">
                   <pic:nvPicPr>
-                    <pic:cNvPr id="1184301709" name=""/>
+                    <pic:cNvPr id="1502895438" name=""/>
                     <pic:cNvPicPr/>
                   </pic:nvPicPr>
                   <pic:blipFill>
-                    <a:blip r:embed="rId5"/>
+                    <a:blip r:embed="rId6"/>
                     <a:stretch>
                       <a:fillRect/>
                     </a:stretch>
@@ -66,7 +103,44 @@
                   <pic:spPr>
                     <a:xfrm>
                       <a:off x="0" y="0"/>
-                      <a:ext cx="5733415" cy="6235065"/>
+                      <a:ext cx="5733415" cy="3046095"/>
+                    </a:xfrm>
+                    <a:prstGeom prst="rect">
+                      <a:avLst/>
+                    </a:prstGeom>
+                  </pic:spPr>
+                </pic:pic>
+              </a:graphicData>
+            </a:graphic>
+          </wp:inline>
+        </w:drawing>
+      </w:r>
+      <w:r>
+        <w:drawing>
+          <wp:inline distT="0" distB="0" distL="0" distR="0" wp14:anchorId="37B19D81" wp14:editId="29D11F3A">
+            <wp:extent cx="5733415" cy="3046095"/>
+            <wp:effectExtent l="0" t="0" r="635" b="1905"/>
+            <wp:docPr id="145107809" name="Picture 1"/>
+            <wp:cNvGraphicFramePr>
+              <a:graphicFrameLocks xmlns:a="http://schemas.openxmlformats.org/drawingml/2006/main" noChangeAspect="1"/>
+            </wp:cNvGraphicFramePr>
+            <a:graphic xmlns:a="http://schemas.openxmlformats.org/drawingml/2006/main">
+              <a:graphicData uri="http://schemas.openxmlformats.org/drawingml/2006/picture">
+                <pic:pic xmlns:pic="http://schemas.openxmlformats.org/drawingml/2006/picture">
+                  <pic:nvPicPr>
+                    <pic:cNvPr id="145107809" name=""/>
+                    <pic:cNvPicPr/>
+                  </pic:nvPicPr>
+                  <pic:blipFill>
+                    <a:blip r:embed="rId7"/>
+                    <a:stretch>
+                      <a:fillRect/>
+                    </a:stretch>
+                  </pic:blipFill>
+                  <pic:spPr>
+                    <a:xfrm>
+                      <a:off x="0" y="0"/>
+                      <a:ext cx="5733415" cy="3046095"/>
                     </a:xfrm>
                     <a:prstGeom prst="rect">
                       <a:avLst/>
@@ -81,10 +155,10 @@
       <w:r>
         <w:lastRenderedPageBreak/>
         <w:drawing>
-          <wp:inline distT="0" distB="0" distL="0" distR="0" wp14:anchorId="20413C11" wp14:editId="60751D4B">
-            <wp:extent cx="5733415" cy="6235065"/>
-            <wp:effectExtent l="0" t="0" r="635" b="0"/>
-            <wp:docPr id="808087459" name="Picture 1"/>
+          <wp:inline distT="0" distB="0" distL="0" distR="0" wp14:anchorId="7E2D001F" wp14:editId="44FF4B77">
+            <wp:extent cx="5733415" cy="3046095"/>
+            <wp:effectExtent l="0" t="0" r="635" b="1905"/>
+            <wp:docPr id="1432957266" name="Picture 1"/>
             <wp:cNvGraphicFramePr>
               <a:graphicFrameLocks xmlns:a="http://schemas.openxmlformats.org/drawingml/2006/main" noChangeAspect="1"/>
             </wp:cNvGraphicFramePr>
@@ -92,83 +166,7 @@
               <a:graphicData uri="http://schemas.openxmlformats.org/drawingml/2006/picture">
                 <pic:pic xmlns:pic="http://schemas.openxmlformats.org/drawingml/2006/picture">
                   <pic:nvPicPr>
-                    <pic:cNvPr id="808087459" name=""/>
-                    <pic:cNvPicPr/>
-                  </pic:nvPicPr>
-                  <pic:blipFill>
-                    <a:blip r:embed="rId6"/>
-                    <a:stretch>
-                      <a:fillRect/>
-                    </a:stretch>
-                  </pic:blipFill>
-                  <pic:spPr>
-                    <a:xfrm>
-                      <a:off x="0" y="0"/>
-                      <a:ext cx="5733415" cy="6235065"/>
-                    </a:xfrm>
-                    <a:prstGeom prst="rect">
-                      <a:avLst/>
-                    </a:prstGeom>
-                  </pic:spPr>
-                </pic:pic>
-              </a:graphicData>
-            </a:graphic>
-          </wp:inline>
-        </w:drawing>
-      </w:r>
-      <w:r>
-        <w:lastRenderedPageBreak/>
-        <w:drawing>
-          <wp:inline distT="0" distB="0" distL="0" distR="0" wp14:anchorId="133C24F7" wp14:editId="40A1B593">
-            <wp:extent cx="5733415" cy="6235065"/>
-            <wp:effectExtent l="0" t="0" r="635" b="0"/>
-            <wp:docPr id="682870321" name="Picture 1"/>
-            <wp:cNvGraphicFramePr>
-              <a:graphicFrameLocks xmlns:a="http://schemas.openxmlformats.org/drawingml/2006/main" noChangeAspect="1"/>
-            </wp:cNvGraphicFramePr>
-            <a:graphic xmlns:a="http://schemas.openxmlformats.org/drawingml/2006/main">
-              <a:graphicData uri="http://schemas.openxmlformats.org/drawingml/2006/picture">
-                <pic:pic xmlns:pic="http://schemas.openxmlformats.org/drawingml/2006/picture">
-                  <pic:nvPicPr>
-                    <pic:cNvPr id="682870321" name=""/>
-                    <pic:cNvPicPr/>
-                  </pic:nvPicPr>
-                  <pic:blipFill>
-                    <a:blip r:embed="rId7"/>
-                    <a:stretch>
-                      <a:fillRect/>
-                    </a:stretch>
-                  </pic:blipFill>
-                  <pic:spPr>
-                    <a:xfrm>
-                      <a:off x="0" y="0"/>
-                      <a:ext cx="5733415" cy="6235065"/>
-                    </a:xfrm>
-                    <a:prstGeom prst="rect">
-                      <a:avLst/>
-                    </a:prstGeom>
-                  </pic:spPr>
-                </pic:pic>
-              </a:graphicData>
-            </a:graphic>
-          </wp:inline>
-        </w:drawing>
-      </w:r>
-      <w:r>
-        <w:lastRenderedPageBreak/>
-        <w:drawing>
-          <wp:inline distT="0" distB="0" distL="0" distR="0" wp14:anchorId="4BF2E4A0" wp14:editId="632C6EAA">
-            <wp:extent cx="5733415" cy="6235065"/>
-            <wp:effectExtent l="0" t="0" r="635" b="0"/>
-            <wp:docPr id="1880454855" name="Picture 1"/>
-            <wp:cNvGraphicFramePr>
-              <a:graphicFrameLocks xmlns:a="http://schemas.openxmlformats.org/drawingml/2006/main" noChangeAspect="1"/>
-            </wp:cNvGraphicFramePr>
-            <a:graphic xmlns:a="http://schemas.openxmlformats.org/drawingml/2006/main">
-              <a:graphicData uri="http://schemas.openxmlformats.org/drawingml/2006/picture">
-                <pic:pic xmlns:pic="http://schemas.openxmlformats.org/drawingml/2006/picture">
-                  <pic:nvPicPr>
-                    <pic:cNvPr id="1880454855" name=""/>
+                    <pic:cNvPr id="1432957266" name=""/>
                     <pic:cNvPicPr/>
                   </pic:nvPicPr>
                   <pic:blipFill>
@@ -180,7 +178,7 @@
                   <pic:spPr>
                     <a:xfrm>
                       <a:off x="0" y="0"/>
-                      <a:ext cx="5733415" cy="6235065"/>
+                      <a:ext cx="5733415" cy="3046095"/>
                     </a:xfrm>
                     <a:prstGeom prst="rect">
                       <a:avLst/>

</xml_diff>